<commit_message>
docs(b3/T3): B3-T3 완료 기록 + T4 이월 사항 추가 (docs-sync)
CO-Authored-By: Claude Sonnet 4.6 <noreply@anthropic.com>
</commit_message>
<xml_diff>
--- a/Documents/2026-04-22-stage-b3-admin-ui.docx
+++ b/Documents/2026-04-22-stage-b3-admin-ui.docx
@@ -28,7 +28,7 @@
         </w:p>
       </w:sdtContent>
     </w:sdt>
-    <w:bookmarkStart w:id="27" w:name="stage-b3-admin-ui--구현-계획-및-진행-기록"/>
+    <w:bookmarkStart w:id="39" w:name="stage-b3-admin-ui--구현-계획-및-진행-기록"/>
     <w:p>
       <w:pPr>
         <w:pStyle w:val="Heading1"/>
@@ -251,7 +251,17 @@
               <w:pStyle w:val="Compact"/>
             </w:pPr>
             <w:r>
-              <w:t xml:space="preserve">pending</w:t>
+              <w:rPr>
+                <w:b/>
+                <w:bCs/>
+              </w:rPr>
+              <w:t xml:space="preserve">완료</w:t>
+            </w:r>
+            <w:r>
+              <w:t xml:space="preserve"> </w:t>
+            </w:r>
+            <w:r>
+              <w:t xml:space="preserve">(2026-04-22)</w:t>
             </w:r>
           </w:p>
         </w:tc>
@@ -286,7 +296,17 @@
               <w:pStyle w:val="Compact"/>
             </w:pPr>
             <w:r>
-              <w:t xml:space="preserve">pending</w:t>
+              <w:rPr>
+                <w:b/>
+                <w:bCs/>
+              </w:rPr>
+              <w:t xml:space="preserve">완료</w:t>
+            </w:r>
+            <w:r>
+              <w:t xml:space="preserve"> </w:t>
+            </w:r>
+            <w:r>
+              <w:t xml:space="preserve">(2026-04-22)</w:t>
             </w:r>
           </w:p>
         </w:tc>
@@ -1779,7 +1799,7 @@
     </w:p>
     <w:bookmarkEnd w:id="22"/>
     <w:bookmarkEnd w:id="23"/>
-    <w:bookmarkStart w:id="24" w:name="b3-t2-업로드-페이지--api-호출"/>
+    <w:bookmarkStart w:id="27" w:name="b3-t2-업로드-페이지--api-호출"/>
     <w:p>
       <w:pPr>
         <w:pStyle w:val="Heading2"/>
@@ -1788,22 +1808,31 @@
         <w:t xml:space="preserve">B3-T2: 업로드 페이지 + API 호출</w:t>
       </w:r>
     </w:p>
+    <w:bookmarkStart w:id="24" w:name="완료-일시-1"/>
+    <w:p>
+      <w:pPr>
+        <w:pStyle w:val="Heading3"/>
+      </w:pPr>
+      <w:r>
+        <w:t xml:space="preserve">완료 일시</w:t>
+      </w:r>
+    </w:p>
     <w:p>
       <w:pPr>
         <w:pStyle w:val="FirstParagraph"/>
       </w:pPr>
       <w:r>
-        <w:t xml:space="preserve">(미시작 — 상세 계획은 태스크 착수 시 추가)</w:t>
+        <w:t xml:space="preserve">2026-04-22</w:t>
       </w:r>
     </w:p>
     <w:bookmarkEnd w:id="24"/>
-    <w:bookmarkStart w:id="25" w:name="b3-t3-결과-페이지--bbox-오버레이"/>
-    <w:p>
-      <w:pPr>
-        <w:pStyle w:val="Heading2"/>
-      </w:pPr>
-      <w:r>
-        <w:t xml:space="preserve">B3-T3: 결과 페이지 + bbox 오버레이</w:t>
+    <w:bookmarkStart w:id="25" w:name="커밋-1"/>
+    <w:p>
+      <w:pPr>
+        <w:pStyle w:val="Heading3"/>
+      </w:pPr>
+      <w:r>
+        <w:t xml:space="preserve">커밋</w:t>
       </w:r>
     </w:p>
     <w:p>
@@ -1811,29 +1840,905 @@
         <w:pStyle w:val="FirstParagraph"/>
       </w:pPr>
       <w:r>
-        <w:t xml:space="preserve">(미시작 — 상세 계획은 태스크 착수 시 추가)</w:t>
+        <w:rPr>
+          <w:rStyle w:val="VerbatimChar"/>
+        </w:rPr>
+        <w:t xml:space="preserve">493536a</w:t>
+      </w:r>
+      <w:r>
+        <w:t xml:space="preserve"> </w:t>
+      </w:r>
+      <w:r>
+        <w:t xml:space="preserve">—</w:t>
+      </w:r>
+      <w:r>
+        <w:t xml:space="preserve"> </w:t>
+      </w:r>
+      <w:r>
+        <w:rPr>
+          <w:rStyle w:val="VerbatimChar"/>
+        </w:rPr>
+        <w:t xml:space="preserve">feat(b3/T2): upload page + API client + status polling</w:t>
       </w:r>
     </w:p>
     <w:bookmarkEnd w:id="25"/>
-    <w:bookmarkStart w:id="26" w:name="b3-t4-docker--admin-namespace-배포--smoke"/>
-    <w:p>
-      <w:pPr>
-        <w:pStyle w:val="Heading2"/>
-      </w:pPr>
-      <w:r>
-        <w:t xml:space="preserve">B3-T4: Docker + admin namespace 배포 + smoke</w:t>
-      </w:r>
-    </w:p>
-    <w:p>
-      <w:pPr>
-        <w:pStyle w:val="FirstParagraph"/>
-      </w:pPr>
-      <w:r>
-        <w:t xml:space="preserve">(미시작 — 상세 계획은 태스크 착수 시 추가)</w:t>
+    <w:bookmarkStart w:id="26" w:name="생성-파일-1"/>
+    <w:p>
+      <w:pPr>
+        <w:pStyle w:val="Heading3"/>
+      </w:pPr>
+      <w:r>
+        <w:t xml:space="preserve">생성 파일</w:t>
+      </w:r>
+    </w:p>
+    <w:tbl>
+      <w:tblPr>
+        <w:tblStyle w:val="Table"/>
+        <w:tblW w:type="auto" w:w="0"/>
+        <w:tblLook w:firstRow="1" w:lastRow="0" w:firstColumn="0" w:lastColumn="0" w:noHBand="0" w:noVBand="0" w:val="0020"/>
+      </w:tblPr>
+      <w:tblGrid>
+        <w:gridCol w:w="3960"/>
+        <w:gridCol w:w="3960"/>
+      </w:tblGrid>
+      <w:tr>
+        <w:trPr>
+          <w:tblHeader w:val="on"/>
+        </w:trPr>
+        <w:tc>
+          <w:tcPr/>
+          <w:p>
+            <w:pPr>
+              <w:pStyle w:val="Compact"/>
+            </w:pPr>
+            <w:r>
+              <w:t xml:space="preserve">파일</w:t>
+            </w:r>
+          </w:p>
+        </w:tc>
+        <w:tc>
+          <w:tcPr/>
+          <w:p>
+            <w:pPr>
+              <w:pStyle w:val="Compact"/>
+            </w:pPr>
+            <w:r>
+              <w:t xml:space="preserve">역할</w:t>
+            </w:r>
+          </w:p>
+        </w:tc>
+      </w:tr>
+      <w:tr>
+        <w:tc>
+          <w:tcPr/>
+          <w:p>
+            <w:pPr>
+              <w:pStyle w:val="Compact"/>
+            </w:pPr>
+            <w:r>
+              <w:rPr>
+                <w:rStyle w:val="VerbatimChar"/>
+              </w:rPr>
+              <w:t xml:space="preserve">services/admin-ui/app/upload/page.tsx</w:t>
+            </w:r>
+          </w:p>
+        </w:tc>
+        <w:tc>
+          <w:tcPr/>
+          <w:p>
+            <w:pPr>
+              <w:pStyle w:val="Compact"/>
+            </w:pPr>
+            <w:r>
+              <w:t xml:space="preserve">업로드 페이지 서버 컴포넌트</w:t>
+            </w:r>
+          </w:p>
+        </w:tc>
+      </w:tr>
+      <w:tr>
+        <w:tc>
+          <w:tcPr/>
+          <w:p>
+            <w:pPr>
+              <w:pStyle w:val="Compact"/>
+            </w:pPr>
+            <w:r>
+              <w:rPr>
+                <w:rStyle w:val="VerbatimChar"/>
+              </w:rPr>
+              <w:t xml:space="preserve">services/admin-ui/app/upload/upload-form.tsx</w:t>
+            </w:r>
+          </w:p>
+        </w:tc>
+        <w:tc>
+          <w:tcPr/>
+          <w:p>
+            <w:pPr>
+              <w:pStyle w:val="Compact"/>
+            </w:pPr>
+            <w:r>
+              <w:t xml:space="preserve">클라이언트 컴포넌트, 파일 선택·업로드·폴링</w:t>
+            </w:r>
+          </w:p>
+        </w:tc>
+      </w:tr>
+      <w:tr>
+        <w:tc>
+          <w:tcPr/>
+          <w:p>
+            <w:pPr>
+              <w:pStyle w:val="Compact"/>
+            </w:pPr>
+            <w:r>
+              <w:rPr>
+                <w:rStyle w:val="VerbatimChar"/>
+              </w:rPr>
+              <w:t xml:space="preserve">services/admin-ui/lib/api.ts</w:t>
+            </w:r>
+          </w:p>
+        </w:tc>
+        <w:tc>
+          <w:tcPr/>
+          <w:p>
+            <w:pPr>
+              <w:pStyle w:val="Compact"/>
+            </w:pPr>
+            <w:r>
+              <w:t xml:space="preserve">upload-api fetch 클라이언트 (uploadDocument / getDocument / pollDocument)</w:t>
+            </w:r>
+          </w:p>
+        </w:tc>
+      </w:tr>
+    </w:tbl>
+    <w:p>
+      <w:r>
+        <w:pict>
+          <v:rect style="width:0;height:1.5pt" o:hralign="center" o:hrstd="t" o:hr="t"/>
+        </w:pict>
       </w:r>
     </w:p>
     <w:bookmarkEnd w:id="26"/>
     <w:bookmarkEnd w:id="27"/>
+    <w:bookmarkStart w:id="37" w:name="b3-t3-결과-페이지--bbox-오버레이"/>
+    <w:p>
+      <w:pPr>
+        <w:pStyle w:val="Heading2"/>
+      </w:pPr>
+      <w:r>
+        <w:t xml:space="preserve">B3-T3: 결과 페이지 + bbox 오버레이</w:t>
+      </w:r>
+    </w:p>
+    <w:bookmarkStart w:id="28" w:name="완료-일시-2"/>
+    <w:p>
+      <w:pPr>
+        <w:pStyle w:val="Heading3"/>
+      </w:pPr>
+      <w:r>
+        <w:t xml:space="preserve">완료 일시</w:t>
+      </w:r>
+    </w:p>
+    <w:p>
+      <w:pPr>
+        <w:pStyle w:val="FirstParagraph"/>
+      </w:pPr>
+      <w:r>
+        <w:t xml:space="preserve">2026-04-22</w:t>
+      </w:r>
+    </w:p>
+    <w:bookmarkEnd w:id="28"/>
+    <w:bookmarkStart w:id="29" w:name="커밋-2"/>
+    <w:p>
+      <w:pPr>
+        <w:pStyle w:val="Heading3"/>
+      </w:pPr>
+      <w:r>
+        <w:t xml:space="preserve">커밋</w:t>
+      </w:r>
+    </w:p>
+    <w:p>
+      <w:pPr>
+        <w:pStyle w:val="FirstParagraph"/>
+      </w:pPr>
+      <w:r>
+        <w:rPr>
+          <w:rStyle w:val="VerbatimChar"/>
+        </w:rPr>
+        <w:t xml:space="preserve">7109ef2</w:t>
+      </w:r>
+      <w:r>
+        <w:t xml:space="preserve"> </w:t>
+      </w:r>
+      <w:r>
+        <w:t xml:space="preserve">—</w:t>
+      </w:r>
+      <w:r>
+        <w:t xml:space="preserve"> </w:t>
+      </w:r>
+      <w:r>
+        <w:rPr>
+          <w:rStyle w:val="VerbatimChar"/>
+        </w:rPr>
+        <w:t xml:space="preserve">feat(b3/T3): document result viewer + bbox SVG overlay</w:t>
+      </w:r>
+    </w:p>
+    <w:bookmarkEnd w:id="29"/>
+    <w:bookmarkStart w:id="30" w:name="생성수정-파일"/>
+    <w:p>
+      <w:pPr>
+        <w:pStyle w:val="Heading3"/>
+      </w:pPr>
+      <w:r>
+        <w:t xml:space="preserve">생성·수정 파일</w:t>
+      </w:r>
+    </w:p>
+    <w:tbl>
+      <w:tblPr>
+        <w:tblStyle w:val="Table"/>
+        <w:tblW w:type="auto" w:w="0"/>
+        <w:tblLook w:firstRow="1" w:lastRow="0" w:firstColumn="0" w:lastColumn="0" w:noHBand="0" w:noVBand="0" w:val="0020"/>
+      </w:tblPr>
+      <w:tblGrid>
+        <w:gridCol w:w="2640"/>
+        <w:gridCol w:w="2640"/>
+        <w:gridCol w:w="2640"/>
+      </w:tblGrid>
+      <w:tr>
+        <w:trPr>
+          <w:tblHeader w:val="on"/>
+        </w:trPr>
+        <w:tc>
+          <w:tcPr/>
+          <w:p>
+            <w:pPr>
+              <w:pStyle w:val="Compact"/>
+            </w:pPr>
+            <w:r>
+              <w:t xml:space="preserve">파일</w:t>
+            </w:r>
+          </w:p>
+        </w:tc>
+        <w:tc>
+          <w:tcPr/>
+          <w:p>
+            <w:pPr>
+              <w:pStyle w:val="Compact"/>
+            </w:pPr>
+            <w:r>
+              <w:t xml:space="preserve">역할</w:t>
+            </w:r>
+          </w:p>
+        </w:tc>
+        <w:tc>
+          <w:tcPr/>
+          <w:p>
+            <w:pPr>
+              <w:pStyle w:val="Compact"/>
+            </w:pPr>
+            <w:r>
+              <w:t xml:space="preserve">신규/수정</w:t>
+            </w:r>
+          </w:p>
+        </w:tc>
+      </w:tr>
+      <w:tr>
+        <w:tc>
+          <w:tcPr/>
+          <w:p>
+            <w:pPr>
+              <w:pStyle w:val="Compact"/>
+            </w:pPr>
+            <w:r>
+              <w:rPr>
+                <w:rStyle w:val="VerbatimChar"/>
+              </w:rPr>
+              <w:t xml:space="preserve">services/admin-ui/app/documents/[id]/page.tsx</w:t>
+            </w:r>
+          </w:p>
+        </w:tc>
+        <w:tc>
+          <w:tcPr/>
+          <w:p>
+            <w:pPr>
+              <w:pStyle w:val="Compact"/>
+            </w:pPr>
+            <w:r>
+              <w:t xml:space="preserve">SSR 서버 컴포넌트 — 인증 체크 + getDocument + 상태별 렌더링</w:t>
+            </w:r>
+          </w:p>
+        </w:tc>
+        <w:tc>
+          <w:tcPr/>
+          <w:p>
+            <w:pPr>
+              <w:pStyle w:val="Compact"/>
+            </w:pPr>
+            <w:r>
+              <w:t xml:space="preserve">수정(전체 재작성)</w:t>
+            </w:r>
+          </w:p>
+        </w:tc>
+      </w:tr>
+      <w:tr>
+        <w:tc>
+          <w:tcPr/>
+          <w:p>
+            <w:pPr>
+              <w:pStyle w:val="Compact"/>
+            </w:pPr>
+            <w:r>
+              <w:rPr>
+                <w:rStyle w:val="VerbatimChar"/>
+              </w:rPr>
+              <w:t xml:space="preserve">services/admin-ui/app/documents/[id]/bbox-viewer.tsx</w:t>
+            </w:r>
+          </w:p>
+        </w:tc>
+        <w:tc>
+          <w:tcPr/>
+          <w:p>
+            <w:pPr>
+              <w:pStyle w:val="Compact"/>
+            </w:pPr>
+            <w:r>
+              <w:t xml:space="preserve">클라이언트 컴포넌트 — SVG bbox 오버레이 + 접근성 테이블</w:t>
+            </w:r>
+          </w:p>
+        </w:tc>
+        <w:tc>
+          <w:tcPr/>
+          <w:p>
+            <w:pPr>
+              <w:pStyle w:val="Compact"/>
+            </w:pPr>
+            <w:r>
+              <w:t xml:space="preserve">신규</w:t>
+            </w:r>
+          </w:p>
+        </w:tc>
+      </w:tr>
+      <w:tr>
+        <w:tc>
+          <w:tcPr/>
+          <w:p>
+            <w:pPr>
+              <w:pStyle w:val="Compact"/>
+            </w:pPr>
+            <w:r>
+              <w:rPr>
+                <w:rStyle w:val="VerbatimChar"/>
+              </w:rPr>
+              <w:t xml:space="preserve">services/admin-ui/components/status-badge.tsx</w:t>
+            </w:r>
+          </w:p>
+        </w:tc>
+        <w:tc>
+          <w:tcPr/>
+          <w:p>
+            <w:pPr>
+              <w:pStyle w:val="Compact"/>
+            </w:pPr>
+            <w:r>
+              <w:t xml:space="preserve">공통 상태 뱃지 컴포넌트</w:t>
+            </w:r>
+          </w:p>
+        </w:tc>
+        <w:tc>
+          <w:tcPr/>
+          <w:p>
+            <w:pPr>
+              <w:pStyle w:val="Compact"/>
+            </w:pPr>
+            <w:r>
+              <w:t xml:space="preserve">신규</w:t>
+            </w:r>
+          </w:p>
+        </w:tc>
+      </w:tr>
+      <w:tr>
+        <w:tc>
+          <w:tcPr/>
+          <w:p>
+            <w:pPr>
+              <w:pStyle w:val="Compact"/>
+            </w:pPr>
+            <w:r>
+              <w:rPr>
+                <w:rStyle w:val="VerbatimChar"/>
+              </w:rPr>
+              <w:t xml:space="preserve">services/admin-ui/lib/bbox.ts</w:t>
+            </w:r>
+          </w:p>
+        </w:tc>
+        <w:tc>
+          <w:tcPr/>
+          <w:p>
+            <w:pPr>
+              <w:pStyle w:val="Compact"/>
+            </w:pPr>
+            <w:r>
+              <w:t xml:space="preserve">bbox 좌표 유틸 (bboxToPointsStr / confidenceColor / bboxRect)</w:t>
+            </w:r>
+          </w:p>
+        </w:tc>
+        <w:tc>
+          <w:tcPr/>
+          <w:p>
+            <w:pPr>
+              <w:pStyle w:val="Compact"/>
+            </w:pPr>
+            <w:r>
+              <w:t xml:space="preserve">신규</w:t>
+            </w:r>
+          </w:p>
+        </w:tc>
+      </w:tr>
+      <w:tr>
+        <w:tc>
+          <w:tcPr/>
+          <w:p>
+            <w:pPr>
+              <w:pStyle w:val="Compact"/>
+            </w:pPr>
+            <w:r>
+              <w:rPr>
+                <w:rStyle w:val="VerbatimChar"/>
+              </w:rPr>
+              <w:t xml:space="preserve">services/admin-ui/app/upload/upload-form.tsx</w:t>
+            </w:r>
+          </w:p>
+        </w:tc>
+        <w:tc>
+          <w:tcPr/>
+          <w:p>
+            <w:pPr>
+              <w:pStyle w:val="Compact"/>
+            </w:pPr>
+            <w:r>
+              <w:t xml:space="preserve">업로드 후 sessionStorage에 data URL + 크기 저장 추가</w:t>
+            </w:r>
+          </w:p>
+        </w:tc>
+        <w:tc>
+          <w:tcPr/>
+          <w:p>
+            <w:pPr>
+              <w:pStyle w:val="Compact"/>
+            </w:pPr>
+            <w:r>
+              <w:t xml:space="preserve">수정</w:t>
+            </w:r>
+          </w:p>
+        </w:tc>
+      </w:tr>
+    </w:tbl>
+    <w:bookmarkEnd w:id="30"/>
+    <w:bookmarkStart w:id="34" w:name="아키텍처-결정"/>
+    <w:p>
+      <w:pPr>
+        <w:pStyle w:val="Heading3"/>
+      </w:pPr>
+      <w:r>
+        <w:t xml:space="preserve">아키텍처 결정</w:t>
+      </w:r>
+    </w:p>
+    <w:bookmarkStart w:id="31" w:name="원본-이미지-전달-방법-sessionstorage-option-1"/>
+    <w:p>
+      <w:pPr>
+        <w:pStyle w:val="Heading4"/>
+      </w:pPr>
+      <w:r>
+        <w:t xml:space="preserve">원본 이미지 전달 방법: sessionStorage (Option 1)</w:t>
+      </w:r>
+    </w:p>
+    <w:p>
+      <w:pPr>
+        <w:pStyle w:val="Compact"/>
+        <w:numPr>
+          <w:ilvl w:val="0"/>
+          <w:numId w:val="1007"/>
+        </w:numPr>
+      </w:pPr>
+      <w:r>
+        <w:t xml:space="preserve">선택 이유: 순수 프론트엔드, 백엔드 코드 변경 없음, T3 스코프에 적합</w:t>
+      </w:r>
+    </w:p>
+    <w:p>
+      <w:pPr>
+        <w:pStyle w:val="Compact"/>
+        <w:numPr>
+          <w:ilvl w:val="0"/>
+          <w:numId w:val="1007"/>
+        </w:numPr>
+      </w:pPr>
+      <w:r>
+        <w:t xml:space="preserve">제약: 동일 브라우저 세션 내에서만 동작 (크로스-세션 조회 시 "원본 이미지 없음" 표시)</w:t>
+      </w:r>
+    </w:p>
+    <w:p>
+      <w:pPr>
+        <w:pStyle w:val="Compact"/>
+        <w:numPr>
+          <w:ilvl w:val="0"/>
+          <w:numId w:val="1007"/>
+        </w:numPr>
+      </w:pPr>
+      <w:r>
+        <w:t xml:space="preserve">대안(T4 이후): upload-api에</w:t>
+      </w:r>
+      <w:r>
+        <w:t xml:space="preserve"> </w:t>
+      </w:r>
+      <w:r>
+        <w:rPr>
+          <w:rStyle w:val="VerbatimChar"/>
+        </w:rPr>
+        <w:t xml:space="preserve">GET /documents/{id}/original</w:t>
+      </w:r>
+      <w:r>
+        <w:t xml:space="preserve"> </w:t>
+      </w:r>
+      <w:r>
+        <w:t xml:space="preserve">엔드포인트 추가 → S3 presigned URL 또는 스트리밍</w:t>
+      </w:r>
+    </w:p>
+    <w:bookmarkEnd w:id="31"/>
+    <w:bookmarkStart w:id="32" w:name="svg-오버레이-방식"/>
+    <w:p>
+      <w:pPr>
+        <w:pStyle w:val="Heading4"/>
+      </w:pPr>
+      <w:r>
+        <w:t xml:space="preserve">SVG 오버레이 방식</w:t>
+      </w:r>
+    </w:p>
+    <w:p>
+      <w:pPr>
+        <w:pStyle w:val="Compact"/>
+        <w:numPr>
+          <w:ilvl w:val="0"/>
+          <w:numId w:val="1008"/>
+        </w:numPr>
+      </w:pPr>
+      <w:r>
+        <w:t xml:space="preserve">Canvas 대신 SVG 선택 → hover/click 이벤트, 접근성(aria), 스타일링 용이</w:t>
+      </w:r>
+    </w:p>
+    <w:p>
+      <w:pPr>
+        <w:pStyle w:val="Compact"/>
+        <w:numPr>
+          <w:ilvl w:val="0"/>
+          <w:numId w:val="1008"/>
+        </w:numPr>
+      </w:pPr>
+      <w:r>
+        <w:t xml:space="preserve">bbox polygon 클릭 시 항목 선택 + 상세 패널 표시</w:t>
+      </w:r>
+    </w:p>
+    <w:p>
+      <w:pPr>
+        <w:pStyle w:val="Compact"/>
+        <w:numPr>
+          <w:ilvl w:val="0"/>
+          <w:numId w:val="1008"/>
+        </w:numPr>
+      </w:pPr>
+      <w:r>
+        <w:t xml:space="preserve">confidence 색상: green-500 (≥0.9) / yellow-500 (≥0.5) / red-500 (&lt;0.5)</w:t>
+      </w:r>
+    </w:p>
+    <w:p>
+      <w:pPr>
+        <w:pStyle w:val="Compact"/>
+        <w:numPr>
+          <w:ilvl w:val="0"/>
+          <w:numId w:val="1008"/>
+        </w:numPr>
+      </w:pPr>
+      <w:r>
+        <w:t xml:space="preserve">신뢰도 &lt;0.5인 항목은 bbox 위에</w:t>
+      </w:r>
+      <w:r>
+        <w:t xml:space="preserve"> </w:t>
+      </w:r>
+      <w:r>
+        <w:rPr>
+          <w:rStyle w:val="VerbatimChar"/>
+        </w:rPr>
+        <w:t xml:space="preserve">!</w:t>
+      </w:r>
+      <w:r>
+        <w:t xml:space="preserve"> </w:t>
+      </w:r>
+      <w:r>
+        <w:t xml:space="preserve">경고 텍스트 표시</w:t>
+      </w:r>
+    </w:p>
+    <w:bookmarkEnd w:id="32"/>
+    <w:bookmarkStart w:id="33" w:name="sessionstorage-키-규칙"/>
+    <w:p>
+      <w:pPr>
+        <w:pStyle w:val="Heading4"/>
+      </w:pPr>
+      <w:r>
+        <w:t xml:space="preserve">SessionStorage 키 규칙</w:t>
+      </w:r>
+    </w:p>
+    <w:p>
+      <w:pPr>
+        <w:pStyle w:val="Compact"/>
+        <w:numPr>
+          <w:ilvl w:val="0"/>
+          <w:numId w:val="1009"/>
+        </w:numPr>
+      </w:pPr>
+      <w:r>
+        <w:rPr>
+          <w:rStyle w:val="VerbatimChar"/>
+        </w:rPr>
+        <w:t xml:space="preserve">doc:{id}:original</w:t>
+      </w:r>
+      <w:r>
+        <w:t xml:space="preserve"> </w:t>
+      </w:r>
+      <w:r>
+        <w:t xml:space="preserve">— data URL (string)</w:t>
+      </w:r>
+    </w:p>
+    <w:p>
+      <w:pPr>
+        <w:pStyle w:val="Compact"/>
+        <w:numPr>
+          <w:ilvl w:val="0"/>
+          <w:numId w:val="1009"/>
+        </w:numPr>
+      </w:pPr>
+      <w:r>
+        <w:rPr>
+          <w:rStyle w:val="VerbatimChar"/>
+        </w:rPr>
+        <w:t xml:space="preserve">doc:{id}:dim</w:t>
+      </w:r>
+      <w:r>
+        <w:t xml:space="preserve"> </w:t>
+      </w:r>
+      <w:r>
+        <w:t xml:space="preserve">—</w:t>
+      </w:r>
+      <w:r>
+        <w:t xml:space="preserve"> </w:t>
+      </w:r>
+      <w:r>
+        <w:rPr>
+          <w:rStyle w:val="VerbatimChar"/>
+        </w:rPr>
+        <w:t xml:space="preserve">{width}x{height}</w:t>
+      </w:r>
+      <w:r>
+        <w:t xml:space="preserve"> </w:t>
+      </w:r>
+      <w:r>
+        <w:t xml:space="preserve">(string)</w:t>
+      </w:r>
+    </w:p>
+    <w:bookmarkEnd w:id="33"/>
+    <w:bookmarkEnd w:id="34"/>
+    <w:bookmarkStart w:id="35" w:name="빌드-결과-1"/>
+    <w:p>
+      <w:pPr>
+        <w:pStyle w:val="Heading3"/>
+      </w:pPr>
+      <w:r>
+        <w:t xml:space="preserve">빌드 결과</w:t>
+      </w:r>
+    </w:p>
+    <w:p>
+      <w:pPr>
+        <w:pStyle w:val="SourceCode"/>
+      </w:pPr>
+      <w:r>
+        <w:rPr>
+          <w:rStyle w:val="VerbatimChar"/>
+        </w:rPr>
+        <w:t xml:space="preserve">npm run build  →  ✓ 성공</w:t>
+      </w:r>
+      <w:r>
+        <w:br/>
+      </w:r>
+      <w:r>
+        <w:rPr>
+          <w:rStyle w:val="VerbatimChar"/>
+        </w:rPr>
+        <w:t xml:space="preserve">npm run lint   →  ✓ No ESLint warnings or errors</w:t>
+      </w:r>
+      <w:r>
+        <w:br/>
+      </w:r>
+      <w:r>
+        <w:br/>
+      </w:r>
+      <w:r>
+        <w:rPr>
+          <w:rStyle w:val="VerbatimChar"/>
+        </w:rPr>
+        <w:t xml:space="preserve">Route (app)</w:t>
+      </w:r>
+      <w:r>
+        <w:br/>
+      </w:r>
+      <w:r>
+        <w:rPr>
+          <w:rStyle w:val="VerbatimChar"/>
+        </w:rPr>
+        <w:t xml:space="preserve">├ ƒ /documents/[id]    2.33 kB / 89.5 kB</w:t>
+      </w:r>
+      <w:r>
+        <w:br/>
+      </w:r>
+      <w:r>
+        <w:rPr>
+          <w:rStyle w:val="VerbatimChar"/>
+        </w:rPr>
+        <w:t xml:space="preserve">├ ƒ /upload            3.07 kB / 94.1 kB</w:t>
+      </w:r>
+    </w:p>
+    <w:bookmarkEnd w:id="35"/>
+    <w:bookmarkStart w:id="36" w:name="t4-이월-사항"/>
+    <w:p>
+      <w:pPr>
+        <w:pStyle w:val="Heading3"/>
+      </w:pPr>
+      <w:r>
+        <w:t xml:space="preserve">T4 이월 사항</w:t>
+      </w:r>
+    </w:p>
+    <w:tbl>
+      <w:tblPr>
+        <w:tblStyle w:val="Table"/>
+        <w:tblW w:type="auto" w:w="0"/>
+        <w:tblLook w:firstRow="1" w:lastRow="0" w:firstColumn="0" w:lastColumn="0" w:noHBand="0" w:noVBand="0" w:val="0020"/>
+      </w:tblPr>
+      <w:tblGrid>
+        <w:gridCol w:w="3960"/>
+        <w:gridCol w:w="3960"/>
+      </w:tblGrid>
+      <w:tr>
+        <w:trPr>
+          <w:tblHeader w:val="on"/>
+        </w:trPr>
+        <w:tc>
+          <w:tcPr/>
+          <w:p>
+            <w:pPr>
+              <w:pStyle w:val="Compact"/>
+            </w:pPr>
+            <w:r>
+              <w:t xml:space="preserve">항목</w:t>
+            </w:r>
+          </w:p>
+        </w:tc>
+        <w:tc>
+          <w:tcPr/>
+          <w:p>
+            <w:pPr>
+              <w:pStyle w:val="Compact"/>
+            </w:pPr>
+            <w:r>
+              <w:t xml:space="preserve">내용</w:t>
+            </w:r>
+          </w:p>
+        </w:tc>
+      </w:tr>
+      <w:tr>
+        <w:tc>
+          <w:tcPr/>
+          <w:p>
+            <w:pPr>
+              <w:pStyle w:val="Compact"/>
+            </w:pPr>
+            <w:r>
+              <w:t xml:space="preserve">원본 이미지 영속성</w:t>
+            </w:r>
+          </w:p>
+        </w:tc>
+        <w:tc>
+          <w:tcPr/>
+          <w:p>
+            <w:pPr>
+              <w:pStyle w:val="Compact"/>
+            </w:pPr>
+            <w:r>
+              <w:t xml:space="preserve">현재 sessionStorage → T4에서 upload-api GET /original 엔드포인트 추가 검토</w:t>
+            </w:r>
+          </w:p>
+        </w:tc>
+      </w:tr>
+      <w:tr>
+        <w:tc>
+          <w:tcPr/>
+          <w:p>
+            <w:pPr>
+              <w:pStyle w:val="Compact"/>
+            </w:pPr>
+            <w:r>
+              <w:t xml:space="preserve">OCR_RUNNING 자동 갱신</w:t>
+            </w:r>
+          </w:p>
+        </w:tc>
+        <w:tc>
+          <w:tcPr/>
+          <w:p>
+            <w:pPr>
+              <w:pStyle w:val="Compact"/>
+            </w:pPr>
+            <w:r>
+              <w:t xml:space="preserve">현재 "새로고침 안내" 메시지만 → T4에서 AutoRefresh 클라이언트 컴포넌트 (router.refresh() 2초 폴링) 추가 검토</w:t>
+            </w:r>
+          </w:p>
+        </w:tc>
+      </w:tr>
+      <w:tr>
+        <w:tc>
+          <w:tcPr/>
+          <w:p>
+            <w:pPr>
+              <w:pStyle w:val="Compact"/>
+            </w:pPr>
+            <w:r>
+              <w:t xml:space="preserve">next.config.mjs</w:t>
+            </w:r>
+            <w:r>
+              <w:t xml:space="preserve"> </w:t>
+            </w:r>
+            <w:r>
+              <w:rPr>
+                <w:rStyle w:val="VerbatimChar"/>
+              </w:rPr>
+              <w:t xml:space="preserve">output: standalone</w:t>
+            </w:r>
+          </w:p>
+        </w:tc>
+        <w:tc>
+          <w:tcPr/>
+          <w:p>
+            <w:pPr>
+              <w:pStyle w:val="Compact"/>
+            </w:pPr>
+            <w:r>
+              <w:t xml:space="preserve">B3-T4에서 Docker 빌드 시 활성화</w:t>
+            </w:r>
+          </w:p>
+        </w:tc>
+      </w:tr>
+    </w:tbl>
+    <w:p>
+      <w:r>
+        <w:pict>
+          <v:rect style="width:0;height:1.5pt" o:hralign="center" o:hrstd="t" o:hr="t"/>
+        </w:pict>
+      </w:r>
+    </w:p>
+    <w:bookmarkEnd w:id="36"/>
+    <w:bookmarkEnd w:id="37"/>
+    <w:bookmarkStart w:id="38" w:name="b3-t4-docker--admin-namespace-배포--smoke"/>
+    <w:p>
+      <w:pPr>
+        <w:pStyle w:val="Heading2"/>
+      </w:pPr>
+      <w:r>
+        <w:t xml:space="preserve">B3-T4: Docker + admin namespace 배포 + smoke</w:t>
+      </w:r>
+    </w:p>
+    <w:p>
+      <w:pPr>
+        <w:pStyle w:val="FirstParagraph"/>
+      </w:pPr>
+      <w:r>
+        <w:t xml:space="preserve">(미시작 — 상세 계획은 태스크 착수 시 추가)</w:t>
+      </w:r>
+    </w:p>
+    <w:bookmarkEnd w:id="38"/>
+    <w:bookmarkEnd w:id="39"/>
     <w:sectPr>
       <w:footnotePr>
         <w:numRestart w:val="eachSect"/>
@@ -2066,6 +2971,15 @@
     <w:abstractNumId w:val="991"/>
   </w:num>
   <w:num w:numId="1006">
+    <w:abstractNumId w:val="991"/>
+  </w:num>
+  <w:num w:numId="1007">
+    <w:abstractNumId w:val="991"/>
+  </w:num>
+  <w:num w:numId="1008">
+    <w:abstractNumId w:val="991"/>
+  </w:num>
+  <w:num w:numId="1009">
     <w:abstractNumId w:val="991"/>
   </w:num>
 </w:numbering>

</xml_diff>